<commit_message>
added until 10th Feb2025
</commit_message>
<xml_diff>
--- a/Docker/Docker-01.docx
+++ b/Docker/Docker-01.docx
@@ -1047,15 +1047,7 @@
         <w:t xml:space="preserve">When </w:t>
       </w:r>
       <w:r>
-        <w:t xml:space="preserve">there </w:t>
-      </w:r>
-      <w:proofErr w:type="gramStart"/>
-      <w:r>
-        <w:t>is</w:t>
-      </w:r>
-      <w:proofErr w:type="gramEnd"/>
-      <w:r>
-        <w:t xml:space="preserve"> no dependencies between O.S and Containerization, the O.S which has kernels will be shared with bins/libraries. </w:t>
+        <w:t xml:space="preserve">there is no dependencies between O.S and Containerization, the O.S which has kernels will be shared with bins/libraries. </w:t>
       </w:r>
     </w:p>
     <w:p/>
@@ -3198,23 +3190,7 @@
           <w:b/>
           <w:bCs/>
         </w:rPr>
-        <w:t xml:space="preserve">docker image </w:t>
-      </w:r>
-      <w:proofErr w:type="spellStart"/>
-      <w:r>
-        <w:rPr>
-          <w:b/>
-          <w:bCs/>
-        </w:rPr>
-        <w:t>rmi</w:t>
-      </w:r>
-      <w:proofErr w:type="spellEnd"/>
-      <w:r>
-        <w:rPr>
-          <w:b/>
-          <w:bCs/>
-        </w:rPr>
-        <w:t xml:space="preserve"> tomcat</w:t>
+        <w:t>docker image rmi tomcat</w:t>
       </w:r>
     </w:p>
     <w:p>
@@ -3577,7 +3553,28 @@
           <w:b/>
           <w:bCs/>
         </w:rPr>
-        <w:t>container run -itd -p 8080:8080 jenkins:2.30.6</w:t>
+        <w:t>container run -itd -p 8080:8080 jenkins:2.</w:t>
+      </w:r>
+      <w:r>
+        <w:rPr>
+          <w:b/>
+          <w:bCs/>
+        </w:rPr>
+        <w:t>6</w:t>
+      </w:r>
+      <w:r>
+        <w:rPr>
+          <w:b/>
+          <w:bCs/>
+        </w:rPr>
+        <w:t>0.</w:t>
+      </w:r>
+      <w:r>
+        <w:rPr>
+          <w:b/>
+          <w:bCs/>
+        </w:rPr>
+        <w:t>3</w:t>
       </w:r>
     </w:p>
     <w:p/>
@@ -3709,40 +3706,15 @@
           <w:b/>
           <w:bCs/>
         </w:rPr>
-        <w:t>&lt;jenkins container id&gt; cat /var/</w:t>
-      </w:r>
-      <w:proofErr w:type="spellStart"/>
-      <w:r>
-        <w:rPr>
-          <w:b/>
-          <w:bCs/>
-        </w:rPr>
-        <w:t>jenkins</w:t>
-      </w:r>
-      <w:r>
-        <w:rPr>
-          <w:b/>
-          <w:bCs/>
-        </w:rPr>
-        <w:t>_home</w:t>
-      </w:r>
-      <w:proofErr w:type="spellEnd"/>
-      <w:r>
-        <w:rPr>
-          <w:b/>
-          <w:bCs/>
-        </w:rPr>
-        <w:t>/secrets/</w:t>
-      </w:r>
-      <w:proofErr w:type="spellStart"/>
-      <w:r>
-        <w:rPr>
-          <w:b/>
-          <w:bCs/>
-        </w:rPr>
-        <w:t>initialAdminPassword</w:t>
-      </w:r>
-      <w:proofErr w:type="spellEnd"/>
+        <w:t>&lt;jenkins container id&gt; cat /var/jenkins</w:t>
+      </w:r>
+      <w:r>
+        <w:rPr>
+          <w:b/>
+          <w:bCs/>
+        </w:rPr>
+        <w:t>_home/secrets/initialAdminPassword</w:t>
+      </w:r>
       <w:r>
         <w:rPr>
           <w:b/>
@@ -3957,13 +3929,8 @@
     </w:p>
     <w:p/>
     <w:p>
-      <w:proofErr w:type="gramStart"/>
-      <w:r>
-        <w:t>#!/</w:t>
-      </w:r>
-      <w:proofErr w:type="gramEnd"/>
-      <w:r>
-        <w:t>bin/bash</w:t>
+      <w:r>
+        <w:t>#!/bin/bash</w:t>
       </w:r>
     </w:p>
     <w:p>
@@ -4000,21 +3967,14 @@
       </w:r>
     </w:p>
     <w:p>
-      <w:proofErr w:type="spellStart"/>
-      <w:r>
-        <w:t>uname</w:t>
-      </w:r>
-      <w:proofErr w:type="spellEnd"/>
-      <w:r>
-        <w:t xml:space="preserve"> -a</w:t>
-      </w:r>
-    </w:p>
-    <w:p>
-      <w:proofErr w:type="spellStart"/>
+      <w:r>
+        <w:t>uname -a</w:t>
+      </w:r>
+    </w:p>
+    <w:p>
       <w:r>
         <w:t>whoami</w:t>
       </w:r>
-      <w:proofErr w:type="spellEnd"/>
     </w:p>
     <w:p/>
     <w:p>
@@ -4225,6 +4185,7 @@
         <w:rPr>
           <w:b/>
           <w:bCs/>
+          <w:noProof/>
         </w:rPr>
         <w:drawing>
           <wp:inline distT="0" distB="0" distL="0" distR="0" wp14:anchorId="7BDFE735" wp14:editId="0149A530">
@@ -4282,6 +4243,7 @@
         <w:rPr>
           <w:b/>
           <w:bCs/>
+          <w:noProof/>
         </w:rPr>
         <w:lastRenderedPageBreak/>
         <w:drawing>
@@ -4374,6 +4336,7 @@
         <w:rPr>
           <w:b/>
           <w:bCs/>
+          <w:noProof/>
         </w:rPr>
         <w:lastRenderedPageBreak/>
         <w:drawing>

</xml_diff>